<commit_message>
Publish reviewed report with author reflection and MIT attribution
</commit_message>
<xml_diff>
--- a/docs/report/MMA3001_Jet_Bridge_Submission_Draft.docx
+++ b/docs/report/MMA3001_Jet_Bridge_Submission_Draft.docx
@@ -25,7 +25,7 @@
     </w:p>
     <w:p>
       <w:r>
-        <w:t>26 October 2026 | https://github.com/matt-b-0/jetbridge-ml-cfd</w:t>
+        <w:t>27 October 2026 | https://github.com/matt-b-0/jetbridge-ml-cfd</w:t>
       </w:r>
     </w:p>
     <w:p>
@@ -102,7 +102,7 @@
           <w:noProof/>
         </w:rPr>
         <w:drawing>
-          <wp:inline distT="0" distB="0" distL="0" distR="0" wp14:anchorId="790C6994" wp14:editId="6C3B396A">
+          <wp:inline distT="0" distB="0" distL="0" distR="0" wp14:anchorId="1DD4C9EF" wp14:editId="07539657">
             <wp:extent cx="5623560" cy="2430757"/>
             <wp:effectExtent l="0" t="0" r="0" b="0"/>
             <wp:docPr id="1" name="Picture 1" descr="Source laboratory geometry and the matched 10 ft array. The sloped floor must be included when converting local sensor heights to absolute laboratory height."/>
@@ -1030,7 +1030,7 @@
           <w:noProof/>
         </w:rPr>
         <w:drawing>
-          <wp:inline distT="0" distB="0" distL="0" distR="0" wp14:anchorId="37169204" wp14:editId="77EC7CB1">
+          <wp:inline distT="0" distB="0" distL="0" distR="0" wp14:anchorId="2CBB4A25" wp14:editId="28182C4F">
             <wp:extent cx="5989320" cy="3405949"/>
             <wp:effectExtent l="0" t="0" r="0" b="0"/>
             <wp:docPr id="2" name="Picture 2" descr="S01-A-10-HN-1 measurements and full-array refits on a common speed scale. Hatching marks extrapolation; only 41.3% of physical area lies within the full-array hull. Panel D shows prediction-minus-observation residuals from location withholding, with circles for RBF and squares for SVR; small horizontal offsets distinguish methods. The refits do not generate the reported cross-validation scores."/>
@@ -1120,7 +1120,7 @@
           <w:noProof/>
         </w:rPr>
         <w:drawing>
-          <wp:inline distT="0" distB="0" distL="0" distR="0" wp14:anchorId="467878F4" wp14:editId="16C4FCCA">
+          <wp:inline distT="0" distB="0" distL="0" distR="0" wp14:anchorId="42689563" wp14:editId="4137C3C4">
             <wp:extent cx="5989320" cy="2638440"/>
             <wp:effectExtent l="0" t="0" r="0" b="0"/>
             <wp:docPr id="3" name="Picture 3" descr="Mean paired RBF-minus-SVR RMSE at each station. Negative values favour RBF. The 58 ft station is also the only station with the 24-point layout; station and sensor density are confounded."/>
@@ -2153,7 +2153,7 @@
           <w:noProof/>
         </w:rPr>
         <w:drawing>
-          <wp:inline distT="0" distB="0" distL="0" distR="0" wp14:anchorId="1E228430" wp14:editId="2D35DEC2">
+          <wp:inline distT="0" distB="0" distL="0" distR="0" wp14:anchorId="135E1703" wp14:editId="1BA59BA5">
             <wp:extent cx="5989320" cy="4236348"/>
             <wp:effectExtent l="0" t="0" r="0" b="0"/>
             <wp:docPr id="4" name="Picture 4" descr="CFD reference and RBF/SVR reconstructions above; signed full-section errors below. Shared scales support comparison, and black dots mark training samples. Neither smoothness nor net-flow consistency establishes agreement with the physical apparatus."/>
@@ -2238,7 +2238,7 @@
           <w:noProof/>
         </w:rPr>
         <w:drawing>
-          <wp:inline distT="0" distB="0" distL="0" distR="0" wp14:anchorId="06AF9099" wp14:editId="184AE213">
+          <wp:inline distT="0" distB="0" distL="0" distR="0" wp14:anchorId="3B50BC58" wp14:editId="235646AD">
             <wp:extent cx="5989320" cy="3176332"/>
             <wp:effectExtent l="0" t="0" r="0" b="0"/>
             <wp:docPr id="5" name="Picture 5" descr="Two hundred common perturbation draws applied to both models at the matched 10 ft geometry. Box centres are medians, boxes are Q1–Q3 and whiskers extend to points within 1.5 IQR. This is a sensitivity scenario based on observed between-run variation, not a predictive uncertainty interval."/>
@@ -2974,7 +2974,7 @@
     </w:p>
     <w:p>
       <w:r>
-        <w:t>The repository separates experimental processing, interpolation, ML and CFD interfaces. Scripts save hashes, split audits, search records and benchmark repetitions. The report extension adds source, selected input evidence, figure data and a test report; 75 tests pass. Generated HTML/API documentation is included. Raw FAA records and large CFD fields remain external, with acquisition and regeneration instructions. The accompanying submission audit distinguishes local reproducibility from public availability; the final-review audit records the published revision separately from the document packaging commit. The licence remains undecided by the author.</w:t>
+        <w:t>The repository separates experimental processing, interpolation, ML and CFD interfaces. Scripts save hashes, split audits, search records and benchmark repetitions. The report extension adds source, selected input evidence, figure data and a test report; 82 tests pass. Generated HTML/API documentation is included. The required FAA/NRC subset and archived CFD samples are bundled with hashes and attribution. The run_all.py live profile regenerates figures and runs the baseline CFD case; full fields are regenerated rather than committed. The accompanying submission audit distinguishes local reproducibility from public availability; the final-review audit records the published revision separately from the document packaging commit. Project code is published under the MIT licence; external FAA/NRC data retain CC BY 4.0 attribution.</w:t>
       </w:r>
     </w:p>
     <w:p>
@@ -3041,12 +3041,27 @@
         <w:pStyle w:val="Heading2"/>
       </w:pPr>
       <w:r>
-        <w:t>AI use and individual learning</w:t>
+        <w:t>AI Use and Individual Learning</w:t>
       </w:r>
     </w:p>
     <w:p>
       <w:r>
-        <w:t>AI assistance supported parsing, workflow and plotting code, numerical checks, documentation and this report scaffold. Verification included unit tests, coordinate/source audits, repeated outputs, mesh checks, solver logs and hosted CI. Errors found during development included a probe-window bug and coordinate-dependent geometric tie selection; these were corrected and recorded in the AI-use log [4].</w:t>
+        <w:t>This project developed from my previous experience investigating CFD simulations of the jet bridge and identifying discrepancies between experimental airflow measurements and numerical predictions. I established the engineering objectives and directed the investigation towards comparing numerical interpolation and machine learning methods, with OpenFOAM providing an additional reference for evaluating spatial reconstruction.</w:t>
+      </w:r>
+    </w:p>
+    <w:p>
+      <w:r>
+        <w:t>I used ChatGPT to assist with initial project planning and Codex extensively to support Python implementation, debugging, automated testing, visualisation and report development. My focus was on understanding the numerical methods, assessing their suitability and critically interpreting the results rather than relying solely on generated outputs.</w:t>
+      </w:r>
+    </w:p>
+    <w:p>
+      <w:r>
+        <w:t>Throughout the project, issues involving coordinate conversion, sensor measurement windows and CFD convergence highlighted the importance of verification. In particular, investigating the disagreement between experimental measurements and mass-conserving CFD predictions reinforced my understanding that numerical convergence does not establish physical accuracy.</w:t>
+      </w:r>
+    </w:p>
+    <w:p>
+      <w:r>
+        <w:t>The project strengthened my understanding of interpolation, regression, numerical validation and computational modelling. AI accelerated the development process, while the engineering objectives, interpretation of limitations and final conclusions remained central to my contribution.</w:t>
       </w:r>
     </w:p>
     <w:p>
@@ -3076,7 +3091,7 @@
     </w:p>
     <w:p>
       <w:r>
-        <w:t>[4] Jet bridge project repository (2026). jetbridge-ml-cfd. https://github.com/matt-b-0/jetbridge-ml-cfd. Implementation and evidence commit 6c6cf81103f9644dcc6b3adebfcd3ff01775537e, generated 26 October 2026. Repository availability and clean-clone checks are recorded in the final-review audit. See docs/assumptions.md, docs/ai_usage_log.md and saved result manifests. The final submitted clone must include the recorded implementation revision and its external-data regeneration instructions.</w:t>
+        <w:t>[4] Jet bridge project repository (2026). jetbridge-ml-cfd. https://github.com/matt-b-0/jetbridge-ml-cfd. Implementation and evidence commit 513e94da8281fd98604d0e702ff7493127115e2a, generated 27 October 2026. Repository availability and clean-clone checks are recorded in the final-review audit. See docs/assumptions.md, docs/ai_usage_log.md and saved result manifests. The final submitted clone must include the recorded implementation revision and its external-data regeneration instructions.</w:t>
       </w:r>
     </w:p>
     <w:p>
@@ -3109,7 +3124,7 @@
     </w:p>
     <w:p>
       <w:r>
-        <w:t>Experimental raw files and large OpenFOAM fields remain external to Git. Derived report figures and benchmark tables are generated from the existing saved analysis. Experimental metrics use equal-run aggregation on common support. CFD layouts, the three-dimensional surrogate and noise-gain diagnostics use different evaluation designs, identified in their captions and accompanying text. No thermal field is included as trusted training data.</w:t>
+        <w:t>Selected raw records are bundled in Git; full OpenFOAM fields are regenerated. Derived report figures and benchmark tables are generated from the existing saved analysis. Experimental metrics use equal-run aggregation on common support. CFD layouts, the three-dimensional surrogate and noise-gain diagnostics use different evaluation designs, identified in their captions and accompanying text. No thermal field is included as trusted training data.</w:t>
       </w:r>
     </w:p>
     <w:p>
@@ -3124,7 +3139,7 @@
     </w:p>
     <w:p>
       <w:r>
-        <w:t>This figure documents an unsuccessful numerical extension. They must not be interpreted as a validated thermal ventilation prediction. The original buoyant run diverged with maximum speed above 62,000 m/s. The subsequent restart saved a field at iteration 967 even though its log reached 1000; continuation starts from the saved field and ends at 1967. Relaxation and initialisation differ from the zero-gravity control, preventing attribution of field differences solely to converged buoyancy.</w:t>
+        <w:t>These results document an unsuccessful numerical extension. They must not be interpreted as a validated thermal ventilation prediction. The original buoyant run diverged with maximum speed above 62,000 m/s. The subsequent restart saved a field at iteration 967 even though its log reached 1000; continuation starts from the saved field and ends at 1967. Relaxation and initialisation differ from the zero-gravity control, preventing attribution of field differences solely to converged buoyancy.</w:t>
       </w:r>
     </w:p>
     <w:p>
@@ -3137,7 +3152,7 @@
           <w:noProof/>
         </w:rPr>
         <w:drawing>
-          <wp:inline distT="0" distB="0" distL="0" distR="0" wp14:anchorId="0BCFB7FD" wp14:editId="3AD22A85">
+          <wp:inline distT="0" distB="0" distL="0" distR="0" wp14:anchorId="3FE211FF" wp14:editId="5ED9317C">
             <wp:extent cx="5852160" cy="2429331"/>
             <wp:effectExtent l="0" t="0" r="0" b="0"/>
             <wp:docPr id="6" name="Picture 6" descr="Thermal residual, stationarity and conservation screens. Ratios above one fail the stated diagnostic threshold. Low flux imbalance does not override failed residual and stationarity checks."/>
@@ -3212,7 +3227,7 @@
           <w:noProof/>
         </w:rPr>
         <w:drawing>
-          <wp:inline distT="0" distB="0" distL="0" distR="0" wp14:anchorId="2BB60057" wp14:editId="0037E326">
+          <wp:inline distT="0" distB="0" distL="0" distR="0" wp14:anchorId="4D4C57AF" wp14:editId="04CCB529">
             <wp:extent cx="5852160" cy="1834999"/>
             <wp:effectExtent l="0" t="0" r="0" b="0"/>
             <wp:docPr id="7" name="Picture 7" descr="Reduced diffusion verification using FTCS, backward Euler and Crank–Nicolson. Stability and accuracy are separate properties; an implicit stable scheme can still have substantial time-discretisation error."/>
@@ -7004,7 +7019,7 @@
           <w:noProof/>
         </w:rPr>
         <w:drawing>
-          <wp:inline distT="0" distB="0" distL="0" distR="0" wp14:anchorId="7B11DE9A" wp14:editId="7795A3D1">
+          <wp:inline distT="0" distB="0" distL="0" distR="0" wp14:anchorId="3C4E9E8A" wp14:editId="2F24FA43">
             <wp:extent cx="5669280" cy="2668905"/>
             <wp:effectExtent l="0" t="0" r="0" b="0"/>
             <wp:docPr id="8" name="Picture 8" descr="Matched cell-point CFD speed against twelve experimental means with horizontal ±1 temporal SD bars from the raw record. Bars describe fluctuating readings, not uncertainty of the mean, and no independence-based standard-error reduction is applied."/>
@@ -7079,7 +7094,7 @@
           <w:noProof/>
         </w:rPr>
         <w:drawing>
-          <wp:inline distT="0" distB="0" distL="0" distR="0" wp14:anchorId="42BA8A7A" wp14:editId="095F4669">
+          <wp:inline distT="0" distB="0" distL="0" distR="0" wp14:anchorId="38A1A5EC" wp14:editId="2C671073">
             <wp:extent cx="5989320" cy="3405949"/>
             <wp:effectExtent l="0" t="0" r="0" b="0"/>
             <wp:docPr id="9" name="Picture 9" descr="S01-A-58-HN-1 measurements, RBF/SVR full-array refits and genuine held-location residuals. Circles are RBF and squares SVR, with small horizontal offsets. All speed panels share a scale including unphysical RBF extrapolation; hatching must not be interpreted as validated area."/>
@@ -7463,31 +7478,31 @@
       </w:rPr>
     </w:lvl>
   </w:abstractNum>
-  <w:num w:numId="1" w16cid:durableId="1124495504">
+  <w:num w:numId="1" w16cid:durableId="2085639701">
     <w:abstractNumId w:val="8"/>
   </w:num>
-  <w:num w:numId="2" w16cid:durableId="1099132370">
+  <w:num w:numId="2" w16cid:durableId="1265186195">
     <w:abstractNumId w:val="6"/>
   </w:num>
-  <w:num w:numId="3" w16cid:durableId="110978449">
+  <w:num w:numId="3" w16cid:durableId="898443926">
     <w:abstractNumId w:val="5"/>
   </w:num>
-  <w:num w:numId="4" w16cid:durableId="52167555">
+  <w:num w:numId="4" w16cid:durableId="1575503988">
     <w:abstractNumId w:val="4"/>
   </w:num>
-  <w:num w:numId="5" w16cid:durableId="1016537334">
+  <w:num w:numId="5" w16cid:durableId="616713772">
     <w:abstractNumId w:val="7"/>
   </w:num>
-  <w:num w:numId="6" w16cid:durableId="1150681285">
+  <w:num w:numId="6" w16cid:durableId="1461605478">
     <w:abstractNumId w:val="3"/>
   </w:num>
-  <w:num w:numId="7" w16cid:durableId="1923492361">
+  <w:num w:numId="7" w16cid:durableId="699013274">
     <w:abstractNumId w:val="2"/>
   </w:num>
-  <w:num w:numId="8" w16cid:durableId="469636119">
+  <w:num w:numId="8" w16cid:durableId="510610697">
     <w:abstractNumId w:val="1"/>
   </w:num>
-  <w:num w:numId="9" w16cid:durableId="1805852300">
+  <w:num w:numId="9" w16cid:durableId="2145542130">
     <w:abstractNumId w:val="0"/>
   </w:num>
 </w:numbering>

</xml_diff>